<commit_message>
check_record: --input substitutes captured text; paraphrase guard ported from the work rebuild
A model that writes the YAML itself types its own advisory_text, so citations were checked
against the model's copy. --input CVE.input.json now replaces advisory_text/source/source_url/
retrieved from the capture before checking (prints TEXT SUBSTITUTED FROM CAPTURE); without it
the tool warns. Paraphrase fixture (internally consistent, passes without --input, fails with)
+ four tests; guard proven: substitute() no-op -> 2 tests red. Brief sections 0/6/8, RULES and
HANDOVER updated and regenerated.

Co-Authored-By: Claude Fable 5.1 <noreply@anthropic.com>
Claude-Session: https://claude.ai/code/session_01SZkVFi8ZpiCXLQfQmfrnse
</commit_message>
<xml_diff>
--- a/precondition_extraction/docs/precondition-tool-HANDOVER.docx
+++ b/precondition_extraction/docs/precondition-tool-HANDOVER.docx
@@ -365,20 +365,29 @@
           <w:sz w:val="18"/>
           <w:szCs w:val="18"/>
         </w:rPr>
-        <w:t xml:space="preserve">python3 check_record.py CVE-2024-38475.yaml          # 3. PASS/FAIL per condition, then ACCEPTED or REJECTED</w:t>
-      </w:r>
-    </w:p>
-    <w:p>
-      <w:pPr>
-        <w:spacing w:after="160"/>
-      </w:pPr>
-    </w:p>
-    <w:p>
-      <w:pPr>
-        <w:spacing w:after="160"/>
-      </w:pPr>
-      <w:r>
-        <w:t xml:space="preserve">4. A person reads each quoted sentence: is it really a condition, is the category right, is </w:t>
+        <w:t xml:space="preserve">python3 check_record.py CVE-2024-38475.yaml --input CVE-2024-38475.input.json   # 3. PASS/FAIL per condition, then ACCEPTED or REJECTED</w:t>
+      </w:r>
+    </w:p>
+    <w:p>
+      <w:pPr>
+        <w:spacing w:after="160"/>
+      </w:pPr>
+    </w:p>
+    <w:p>
+      <w:pPr>
+        <w:spacing w:after="160"/>
+      </w:pPr>
+      <w:r>
+        <w:t xml:space="preserve">Always with </w:t>
+      </w:r>
+      <w:r>
+        <w:rPr>
+          <w:rFonts w:ascii="Consolas" w:cs="Consolas" w:eastAsia="Consolas" w:hAnsi="Consolas"/>
+        </w:rPr>
+        <w:t xml:space="preserve">--input</w:t>
+      </w:r>
+      <w:r>
+        <w:t xml:space="preserve">. It replaces the text the model typed with the captured text before checking. Without it the tool prints a warning and the result is unverified. 4. A person reads each quoted sentence: is it really a condition, is the category right, is </w:t>
       </w:r>
       <w:r>
         <w:rPr>
@@ -560,6 +569,26 @@
       </w:r>
       <w:r>
         <w:t xml:space="preserve"> for records you rely on. If the advisory text changed, the citations may no longer match, and that is the signal you want.</w:t>
+      </w:r>
+    </w:p>
+    <w:p>
+      <w:pPr>
+        <w:pStyle w:val="ListParagraph"/>
+        <w:numPr>
+          <w:ilvl w:val="0"/>
+          <w:numId w:val="1"/>
+        </w:numPr>
+        <w:spacing w:after="120"/>
+      </w:pPr>
+      <w:r>
+        <w:rPr>
+          <w:b/>
+          <w:bCs/>
+        </w:rPr>
+        <w:t xml:space="preserve">Never accept a record checked without `--input`.</w:t>
+      </w:r>
+      <w:r>
+        <w:t xml:space="preserve"> The warning line exists so that a check against the model's own copy of the text is visibly second-class.</w:t>
       </w:r>
     </w:p>
     <w:p>

</xml_diff>